<commit_message>
docs: añadir documentacion metodologia agil
</commit_message>
<xml_diff>
--- a/Fase 1/Evidencias Grupales/1.5_GuiaEstudiante_Fase 1_Definicion Proyecto APT (Español).docx
+++ b/Fase 1/Evidencias Grupales/1.5_GuiaEstudiante_Fase 1_Definicion Proyecto APT (Español).docx
@@ -218,7 +218,7 @@
               </wp:anchor>
             </w:drawing>
           </mc:Choice>
-          <mc:Fallback xmlns:cr="http://schemas.microsoft.com/office/comments/2020/reactions" xmlns="http://schemas.microsoft.com/office/tasks/2019/documenttasks" xmlns:dgm="http://schemas.openxmlformats.org/drawingml/2006/diagram" xmlns:lc="http://schemas.openxmlformats.org/drawingml/2006/lockedCanvas" xmlns:c="http://schemas.openxmlformats.org/drawingml/2006/chart" xmlns:pic="http://schemas.openxmlformats.org/drawingml/2006/picture" xmlns:a="http://schemas.openxmlformats.org/drawingml/2006/main" xmlns:sl="http://schemas.openxmlformats.org/schemaLibrary/2006/main">
+          <mc:Fallback xmlns:sl="http://schemas.openxmlformats.org/schemaLibrary/2006/main" xmlns:a="http://schemas.openxmlformats.org/drawingml/2006/main" xmlns:pic="http://schemas.openxmlformats.org/drawingml/2006/picture" xmlns:c="http://schemas.openxmlformats.org/drawingml/2006/chart" xmlns:lc="http://schemas.openxmlformats.org/drawingml/2006/lockedCanvas" xmlns:dgm="http://schemas.openxmlformats.org/drawingml/2006/diagram" xmlns="http://schemas.microsoft.com/office/tasks/2019/documenttasks" xmlns:cr="http://schemas.microsoft.com/office/comments/2020/reactions">
             <w:drawing>
               <wp:anchor allowOverlap="1" behindDoc="0" distB="0" distT="0" distL="114300" distR="114300" hidden="0" layoutInCell="1" locked="0" relativeHeight="0" simplePos="0">
                 <wp:simplePos x="0" y="0"/>
@@ -437,7 +437,7 @@
       </w:tblGrid>
       <w:tr>
         <w:trPr>
-          <w:trHeight w:val="440"/>
+          <w:trHeight w:val="1741"/>
         </w:trPr>
         <w:tc>
           <w:tcPr>
@@ -6659,6 +6659,7 @@
       <w:tr>
         <w:trPr>
           <w:gridAfter w:val="1"/>
+          <w:wAfter w:w="10" w:type="dxa"/>
           <w:trHeight w:val="303"/>
         </w:trPr>
         <w:tc>
@@ -7159,6 +7160,7 @@
       <w:tr>
         <w:trPr>
           <w:gridAfter w:val="1"/>
+          <w:wAfter w:w="10" w:type="dxa"/>
           <w:trHeight w:val="294"/>
         </w:trPr>
         <w:tc>
@@ -7343,6 +7345,7 @@
           <w:p>
             <w:pPr>
               <w:spacing w:line="360" w:lineRule="auto"/>
+              <w:ind w:left="720" w:hanging="720"/>
               <w:jc w:val="both"/>
               <w:rPr>
                 <w:b/>
@@ -7494,6 +7497,7 @@
       <w:tr>
         <w:trPr>
           <w:gridAfter w:val="1"/>
+          <w:wAfter w:w="10" w:type="dxa"/>
           <w:trHeight w:val="303"/>
         </w:trPr>
         <w:tc>
@@ -7830,6 +7834,7 @@
       <w:tr>
         <w:trPr>
           <w:gridAfter w:val="1"/>
+          <w:wAfter w:w="10" w:type="dxa"/>
           <w:trHeight w:val="294"/>
         </w:trPr>
         <w:tc>
@@ -8165,6 +8170,7 @@
       <w:tr>
         <w:trPr>
           <w:gridAfter w:val="1"/>
+          <w:wAfter w:w="10" w:type="dxa"/>
           <w:trHeight w:val="294"/>
         </w:trPr>
         <w:tc>
@@ -8438,6 +8444,7 @@
       <w:tr>
         <w:trPr>
           <w:gridAfter w:val="1"/>
+          <w:wAfter w:w="10" w:type="dxa"/>
           <w:trHeight w:val="294"/>
         </w:trPr>
         <w:tc>
@@ -8701,6 +8708,7 @@
       <w:tr>
         <w:trPr>
           <w:gridAfter w:val="1"/>
+          <w:wAfter w:w="10" w:type="dxa"/>
           <w:trHeight w:val="294"/>
         </w:trPr>
         <w:tc>
@@ -8964,6 +8972,7 @@
       <w:tr>
         <w:trPr>
           <w:gridAfter w:val="1"/>
+          <w:wAfter w:w="10" w:type="dxa"/>
           <w:trHeight w:val="294"/>
         </w:trPr>
         <w:tc>
@@ -9226,6 +9235,7 @@
       <w:tr>
         <w:trPr>
           <w:gridAfter w:val="1"/>
+          <w:wAfter w:w="10" w:type="dxa"/>
           <w:trHeight w:val="294"/>
         </w:trPr>
         <w:tc>
@@ -9490,6 +9500,7 @@
       <w:tr>
         <w:trPr>
           <w:gridAfter w:val="1"/>
+          <w:wAfter w:w="10" w:type="dxa"/>
           <w:trHeight w:val="294"/>
         </w:trPr>
         <w:tc>
@@ -9753,6 +9764,7 @@
       <w:tr>
         <w:trPr>
           <w:gridAfter w:val="1"/>
+          <w:wAfter w:w="10" w:type="dxa"/>
           <w:trHeight w:val="294"/>
         </w:trPr>
         <w:tc>
@@ -10016,6 +10028,7 @@
       <w:tr>
         <w:trPr>
           <w:gridAfter w:val="1"/>
+          <w:wAfter w:w="10" w:type="dxa"/>
           <w:trHeight w:val="294"/>
         </w:trPr>
         <w:tc>
@@ -10280,6 +10293,7 @@
       <w:tr>
         <w:trPr>
           <w:gridAfter w:val="1"/>
+          <w:wAfter w:w="10" w:type="dxa"/>
           <w:trHeight w:val="294"/>
         </w:trPr>
         <w:tc>

</xml_diff>